<commit_message>
Add a live demo with a sample lab
Co-Authored-By: Claude Opus 5.5 <noreply@anthropic.com>
Claude-Session: https://claude.ai/code/session_01B6RpuiKUBJe3rJjwRu1uL4
</commit_message>
<xml_diff>
--- a/Setup guide.docx
+++ b/Setup guide.docx
@@ -45,6 +45,19 @@
       </w:r>
       <w:r>
         <w:t xml:space="preserve">. When an experiment draft is saved, the amounts used are subtracted from stock automatically.</w:t>
+      </w:r>
+    </w:p>
+    <w:p>
+      <w:pPr>
+        <w:pBdr>
+          <w:left w:val="single" w:color="4545BF" w:sz="18" w:space="8"/>
+        </w:pBdr>
+        <w:shd w:fill="EBEBFA" w:color="auto" w:val="clear"/>
+        <w:spacing w:after="160" w:before="80" w:line="290"/>
+        <w:ind w:left="160" w:right="160"/>
+      </w:pPr>
+      <w:r>
+        <w:t xml:space="preserve">Try the live demo first: https://fatemehahmadi999.github.io/lab-inventory-modular/ — a sample lab you can click through. It runs only in your browser; nothing is saved online, and “Start over” resets it.</w:t>
       </w:r>
     </w:p>
     <w:p>

</xml_diff>